<commit_message>
docs: guia para voluntarios con codigos de 4 o 5 numeros
</commit_message>
<xml_diff>
--- a/docs/guia-voluntarios.docx
+++ b/docs/guia-voluntarios.docx
@@ -1820,27 +1820,27 @@
           <w:sz w:val="24"/>
           <w:szCs w:val="24"/>
         </w:rPr>
-        <w:t xml:space="preserve">Escribe solo los </w:t>
-      </w:r>
-      <w:r>
-        <w:rPr>
-          <w:rFonts w:ascii="Arial" w:cs="Arial" w:eastAsia="Arial" w:hAnsi="Arial"/>
-          <w:b/>
-          <w:bCs/>
-          <w:color w:val="1F2937"/>
-          <w:sz w:val="24"/>
-          <w:szCs w:val="24"/>
-        </w:rPr>
-        <w:t xml:space="preserve">4 números</w:t>
-      </w:r>
-      <w:r>
-        <w:rPr>
-          <w:rFonts w:ascii="Arial" w:cs="Arial" w:eastAsia="Arial" w:hAnsi="Arial"/>
-          <w:color w:val="1F2937"/>
-          <w:sz w:val="24"/>
-          <w:szCs w:val="24"/>
-        </w:rPr>
-        <w:t xml:space="preserve">. Busca solo, sin tocar nada más.</w:t>
+        <w:t xml:space="preserve">Escribe solo los números del código (</w:t>
+      </w:r>
+      <w:r>
+        <w:rPr>
+          <w:rFonts w:ascii="Arial" w:cs="Arial" w:eastAsia="Arial" w:hAnsi="Arial"/>
+          <w:b/>
+          <w:bCs/>
+          <w:color w:val="1F2937"/>
+          <w:sz w:val="24"/>
+          <w:szCs w:val="24"/>
+        </w:rPr>
+        <w:t xml:space="preserve">4 o 5</w:t>
+      </w:r>
+      <w:r>
+        <w:rPr>
+          <w:rFonts w:ascii="Arial" w:cs="Arial" w:eastAsia="Arial" w:hAnsi="Arial"/>
+          <w:color w:val="1F2937"/>
+          <w:sz w:val="24"/>
+          <w:szCs w:val="24"/>
+        </w:rPr>
+        <w:t xml:space="preserve">). Busca solo, sin tocar nada más.</w:t>
       </w:r>
     </w:p>
     <w:p>
@@ -1923,7 +1923,7 @@
           <wp:inline distT="0" distB="0" distL="0" distR="0">
             <wp:extent cx="1724025" cy="4476750"/>
             <wp:effectExtent t="0" r="0" b="0" l="0"/>
-            <wp:docPr id="8" name="07-pie-codigo" descr="Con los 4 números aparece el turno a pie que tiene ese código." title="Con los 4 números aparece el turno a pie que tiene ese código."/>
+            <wp:docPr id="8" name="07-pie-codigo" descr="Con los números del código aparece el turno a pie que lo tiene." title="Con los números del código aparece el turno a pie que lo tiene."/>
             <wp:cNvGraphicFramePr>
               <a:graphicFrameLocks xmlns:a="http://schemas.openxmlformats.org/drawingml/2006/main" noChangeAspect="1"/>
             </wp:cNvGraphicFramePr>
@@ -1973,7 +1973,7 @@
           <w:sz w:val="20"/>
           <w:szCs w:val="20"/>
         </w:rPr>
-        <w:t xml:space="preserve">Con los 4 números aparece el turno a pie que tiene ese código.</w:t>
+        <w:t xml:space="preserve">Con los números del código aparece el turno a pie que lo tiene.</w:t>
       </w:r>
     </w:p>
     <w:p>

</xml_diff>